<commit_message>
ADRF6780 & ADMV8818 Config file creation
- added config file for ADRF6780 & ADMV8818
- ADMV8818 not working with config file
- Minor changes to ADRF5048,5144 test plan
</commit_message>
<xml_diff>
--- a/Test Plans/ADRF/ADRF5048_TestPlanV2.docx
+++ b/Test Plans/ADRF/ADRF5048_TestPlanV2.docx
@@ -2517,27 +2517,156 @@
         </w:numPr>
       </w:pPr>
       <w:r>
-        <w:t xml:space="preserve">Connect </w:t>
-      </w:r>
-      <w:r>
-        <w:t>VDD</w:t>
-      </w:r>
-      <w:r>
-        <w:t xml:space="preserve"> input to </w:t>
-      </w:r>
-      <w:r>
-        <w:t>Channel 0 on the 4163</w:t>
-      </w:r>
-      <w:r>
-        <w:t xml:space="preserve"> </w:t>
-      </w:r>
-      <w:r>
-        <w:t xml:space="preserve">(slot 3) </w:t>
-      </w:r>
-      <w:r>
-        <w:t>of the PXI 1095 tester</w:t>
-      </w:r>
-    </w:p>
+        <w:t>Connect the power supplies</w:t>
+      </w:r>
+      <w:r>
+        <w:t xml:space="preserve"> to the 4163 Card</w:t>
+      </w:r>
+    </w:p>
+    <w:tbl>
+      <w:tblPr>
+        <w:tblStyle w:val="TableGrid"/>
+        <w:tblW w:w="0" w:type="auto"/>
+        <w:tblLook w:val="04A0" w:firstRow="1" w:lastRow="0" w:firstColumn="1" w:lastColumn="0" w:noHBand="0" w:noVBand="1"/>
+      </w:tblPr>
+      <w:tblGrid>
+        <w:gridCol w:w="4675"/>
+        <w:gridCol w:w="4675"/>
+      </w:tblGrid>
+      <w:tr>
+        <w:tc>
+          <w:tcPr>
+            <w:tcW w:w="4675" w:type="dxa"/>
+          </w:tcPr>
+          <w:p>
+            <w:r>
+              <w:t>Green 3.6v VDD</w:t>
+            </w:r>
+          </w:p>
+        </w:tc>
+        <w:tc>
+          <w:tcPr>
+            <w:tcW w:w="4675" w:type="dxa"/>
+          </w:tcPr>
+          <w:p>
+            <w:r>
+              <w:t xml:space="preserve">Ch_0 </w:t>
+            </w:r>
+          </w:p>
+        </w:tc>
+      </w:tr>
+      <w:tr>
+        <w:tc>
+          <w:tcPr>
+            <w:tcW w:w="4675" w:type="dxa"/>
+          </w:tcPr>
+          <w:p>
+            <w:r>
+              <w:t>Blue -3.6 VSS</w:t>
+            </w:r>
+          </w:p>
+        </w:tc>
+        <w:tc>
+          <w:tcPr>
+            <w:tcW w:w="4675" w:type="dxa"/>
+          </w:tcPr>
+          <w:p>
+            <w:r>
+              <w:t>Ch_1</w:t>
+            </w:r>
+          </w:p>
+        </w:tc>
+      </w:tr>
+      <w:tr>
+        <w:tc>
+          <w:tcPr>
+            <w:tcW w:w="4675" w:type="dxa"/>
+          </w:tcPr>
+          <w:p>
+            <w:r>
+              <w:t>Brown 0v EN</w:t>
+            </w:r>
+          </w:p>
+        </w:tc>
+        <w:tc>
+          <w:tcPr>
+            <w:tcW w:w="4675" w:type="dxa"/>
+          </w:tcPr>
+          <w:p>
+            <w:r>
+              <w:t>Ch_2</w:t>
+            </w:r>
+          </w:p>
+        </w:tc>
+      </w:tr>
+      <w:tr>
+        <w:tc>
+          <w:tcPr>
+            <w:tcW w:w="4675" w:type="dxa"/>
+          </w:tcPr>
+          <w:p>
+            <w:r>
+              <w:t>Grey 0v LS</w:t>
+            </w:r>
+          </w:p>
+        </w:tc>
+        <w:tc>
+          <w:tcPr>
+            <w:tcW w:w="4675" w:type="dxa"/>
+          </w:tcPr>
+          <w:p>
+            <w:r>
+              <w:t>Ch_3</w:t>
+            </w:r>
+          </w:p>
+        </w:tc>
+      </w:tr>
+      <w:tr>
+        <w:tc>
+          <w:tcPr>
+            <w:tcW w:w="4675" w:type="dxa"/>
+          </w:tcPr>
+          <w:p>
+            <w:r>
+              <w:t>White 0v V1</w:t>
+            </w:r>
+          </w:p>
+        </w:tc>
+        <w:tc>
+          <w:tcPr>
+            <w:tcW w:w="4675" w:type="dxa"/>
+          </w:tcPr>
+          <w:p>
+            <w:r>
+              <w:t>Ch_4</w:t>
+            </w:r>
+          </w:p>
+        </w:tc>
+      </w:tr>
+      <w:tr>
+        <w:tc>
+          <w:tcPr>
+            <w:tcW w:w="4675" w:type="dxa"/>
+          </w:tcPr>
+          <w:p>
+            <w:r>
+              <w:t>White &amp; Red 0v v2</w:t>
+            </w:r>
+          </w:p>
+        </w:tc>
+        <w:tc>
+          <w:tcPr>
+            <w:tcW w:w="4675" w:type="dxa"/>
+          </w:tcPr>
+          <w:p>
+            <w:r>
+              <w:t>Ch_5</w:t>
+            </w:r>
+          </w:p>
+        </w:tc>
+      </w:tr>
+    </w:tbl>
+    <w:p/>
     <w:p>
       <w:pPr>
         <w:pStyle w:val="ListParagraph"/>
@@ -2547,25 +2676,21 @@
         </w:numPr>
       </w:pPr>
       <w:r>
-        <w:t xml:space="preserve">Connect </w:t>
-      </w:r>
-      <w:r>
-        <w:t>VSS</w:t>
-      </w:r>
-      <w:r>
-        <w:t xml:space="preserve"> </w:t>
-      </w:r>
-      <w:r>
-        <w:t xml:space="preserve">input to </w:t>
-      </w:r>
-      <w:r>
-        <w:t xml:space="preserve">Channel </w:t>
-      </w:r>
-      <w:r>
-        <w:t>1</w:t>
-      </w:r>
-      <w:r>
-        <w:t xml:space="preserve"> on the 4163 (slot 3) of the PXI 1095 tester</w:t>
+        <w:t>Connect the PxIe4081 to the beam</w:t>
+      </w:r>
+      <w:r>
+        <w:t>’</w:t>
+      </w:r>
+      <w:r>
+        <w:t xml:space="preserve">s TTL logic via </w:t>
+      </w:r>
+      <w:proofErr w:type="spellStart"/>
+      <w:r>
+        <w:t>bnc</w:t>
+      </w:r>
+      <w:proofErr w:type="spellEnd"/>
+      <w:r>
+        <w:t xml:space="preserve"> /banana jack adaptor on the patch panel</w:t>
       </w:r>
     </w:p>
     <w:p>
@@ -2577,7 +2702,23 @@
         </w:numPr>
       </w:pPr>
       <w:r>
-        <w:t>Connect EN input to Channel 2 on the 4163 (slot 3) of the PXI 1095 tester</w:t>
+        <w:t xml:space="preserve">Connect </w:t>
+      </w:r>
+      <w:r>
+        <w:t>GND to the GND on the 4163 (slot 3) of the PXI 1095 tester</w:t>
+      </w:r>
+    </w:p>
+    <w:p>
+      <w:pPr>
+        <w:pStyle w:val="ListParagraph"/>
+        <w:numPr>
+          <w:ilvl w:val="1"/>
+          <w:numId w:val="2"/>
+        </w:numPr>
+        <w:spacing w:line="276" w:lineRule="auto"/>
+      </w:pPr>
+      <w:r>
+        <w:t>Can connect the PXIe4081 to the shared ground node, but not required</w:t>
       </w:r>
     </w:p>
     <w:p>
@@ -2590,7 +2731,15 @@
         <w:spacing w:line="276" w:lineRule="auto"/>
       </w:pPr>
       <w:r>
-        <w:t>Connect LS input to Channel 3 on the 4163 (slot 3) of the PXI 1095 tester</w:t>
+        <w:t xml:space="preserve">If </w:t>
+      </w:r>
+      <w:proofErr w:type="spellStart"/>
+      <w:r>
+        <w:t>latchup</w:t>
+      </w:r>
+      <w:proofErr w:type="spellEnd"/>
+      <w:r>
+        <w:t xml:space="preserve"> test, put the heat gun on the part and </w:t>
       </w:r>
     </w:p>
     <w:p>
@@ -2600,10 +2749,9 @@
           <w:ilvl w:val="0"/>
           <w:numId w:val="2"/>
         </w:numPr>
-        <w:spacing w:line="276" w:lineRule="auto"/>
-      </w:pPr>
-      <w:r>
-        <w:t>Connect V1 input to Channel 4 on the 4163 (slot 3) of the PXI 1095 tester</w:t>
+      </w:pPr>
+      <w:r>
+        <w:t>Open LabVIEW on NI Tester</w:t>
       </w:r>
     </w:p>
     <w:p>
@@ -2616,7 +2764,34 @@
         <w:spacing w:line="276" w:lineRule="auto"/>
       </w:pPr>
       <w:r>
-        <w:t>Connect V2 input to Channel 5 on the 4163 (slot 3) of the PXI 1095 tester</w:t>
+        <w:t xml:space="preserve">Go to </w:t>
+      </w:r>
+      <w:r>
+        <w:t>C:\</w:t>
+      </w:r>
+      <w:r>
+        <w:t xml:space="preserve"> Git\Rad-Effects-Test-Software\</w:t>
+      </w:r>
+      <w:proofErr w:type="spellStart"/>
+      <w:r>
+        <w:t>SEE_PXI_TopBench.lvproj</w:t>
+      </w:r>
+      <w:proofErr w:type="spellEnd"/>
+    </w:p>
+    <w:p>
+      <w:pPr>
+        <w:pStyle w:val="ListParagraph"/>
+        <w:numPr>
+          <w:ilvl w:val="1"/>
+          <w:numId w:val="2"/>
+        </w:numPr>
+        <w:spacing w:line="276" w:lineRule="auto"/>
+      </w:pPr>
+      <w:r>
+        <w:t>If there is a</w:t>
+      </w:r>
+      <w:r>
+        <w:t xml:space="preserve"> pop up, just press “load with selected”</w:t>
       </w:r>
     </w:p>
     <w:p>
@@ -2626,23 +2801,10 @@
           <w:ilvl w:val="0"/>
           <w:numId w:val="2"/>
         </w:numPr>
-      </w:pPr>
-      <w:r>
-        <w:t>Connect the PxIe4081 to the beam</w:t>
-      </w:r>
-      <w:r>
-        <w:t>’</w:t>
-      </w:r>
-      <w:r>
-        <w:t xml:space="preserve">s TTL logic via </w:t>
-      </w:r>
-      <w:proofErr w:type="spellStart"/>
-      <w:r>
-        <w:t>bnc</w:t>
-      </w:r>
-      <w:proofErr w:type="spellEnd"/>
-      <w:r>
-        <w:t xml:space="preserve"> /banana jack adaptor on the patch panel</w:t>
+        <w:spacing w:line="276" w:lineRule="auto"/>
+      </w:pPr>
+      <w:r>
+        <w:t>If not running, press white arrow</w:t>
       </w:r>
     </w:p>
     <w:p>
@@ -2652,12 +2814,10 @@
           <w:ilvl w:val="0"/>
           <w:numId w:val="2"/>
         </w:numPr>
-      </w:pPr>
-      <w:r>
-        <w:t xml:space="preserve">Connect </w:t>
-      </w:r>
-      <w:r>
-        <w:t>GND to the GND on the 4163 (slot 3) of the PXI 1095 tester</w:t>
+        <w:spacing w:line="276" w:lineRule="auto"/>
+      </w:pPr>
+      <w:r>
+        <w:t>Configure the “Data Block”</w:t>
       </w:r>
     </w:p>
     <w:p>
@@ -2670,7 +2830,143 @@
         <w:spacing w:line="276" w:lineRule="auto"/>
       </w:pPr>
       <w:r>
-        <w:t>Can connect the PXIe4081 to the shared ground node, but not required</w:t>
+        <w:t>Change values in the “Run Data Input</w:t>
+      </w:r>
+      <w:r>
+        <w:t>”</w:t>
+      </w:r>
+      <w:r>
+        <w:t xml:space="preserve"> (Green Block)</w:t>
+      </w:r>
+    </w:p>
+    <w:p>
+      <w:pPr>
+        <w:pStyle w:val="ListParagraph"/>
+        <w:numPr>
+          <w:ilvl w:val="2"/>
+          <w:numId w:val="2"/>
+        </w:numPr>
+        <w:spacing w:line="276" w:lineRule="auto"/>
+      </w:pPr>
+      <w:r>
+        <w:t>RUN FOLDER</w:t>
+      </w:r>
+    </w:p>
+    <w:p>
+      <w:pPr>
+        <w:pStyle w:val="ListParagraph"/>
+        <w:numPr>
+          <w:ilvl w:val="2"/>
+          <w:numId w:val="2"/>
+        </w:numPr>
+        <w:spacing w:line="276" w:lineRule="auto"/>
+      </w:pPr>
+      <w:r>
+        <w:t xml:space="preserve">DUT </w:t>
+      </w:r>
+    </w:p>
+    <w:p>
+      <w:pPr>
+        <w:pStyle w:val="ListParagraph"/>
+        <w:numPr>
+          <w:ilvl w:val="2"/>
+          <w:numId w:val="2"/>
+        </w:numPr>
+        <w:spacing w:line="276" w:lineRule="auto"/>
+      </w:pPr>
+      <w:r>
+        <w:t xml:space="preserve">ION </w:t>
+      </w:r>
+    </w:p>
+    <w:p>
+      <w:pPr>
+        <w:pStyle w:val="ListParagraph"/>
+        <w:numPr>
+          <w:ilvl w:val="2"/>
+          <w:numId w:val="2"/>
+        </w:numPr>
+        <w:spacing w:line="276" w:lineRule="auto"/>
+      </w:pPr>
+      <w:r>
+        <w:t>BOARD NUMBER</w:t>
+      </w:r>
+    </w:p>
+    <w:p>
+      <w:pPr>
+        <w:pStyle w:val="ListParagraph"/>
+        <w:numPr>
+          <w:ilvl w:val="2"/>
+          <w:numId w:val="2"/>
+        </w:numPr>
+        <w:spacing w:line="276" w:lineRule="auto"/>
+      </w:pPr>
+      <w:r>
+        <w:t>EFFECTVE LET</w:t>
+      </w:r>
+    </w:p>
+    <w:p>
+      <w:pPr>
+        <w:pStyle w:val="ListParagraph"/>
+        <w:numPr>
+          <w:ilvl w:val="2"/>
+          <w:numId w:val="2"/>
+        </w:numPr>
+        <w:spacing w:line="276" w:lineRule="auto"/>
+      </w:pPr>
+      <w:r>
+        <w:t>TEST TYPE (NOTE ONLY DOING LATCHUP THIS CAMPAIGN)</w:t>
+      </w:r>
+    </w:p>
+    <w:p>
+      <w:pPr>
+        <w:pStyle w:val="ListParagraph"/>
+        <w:numPr>
+          <w:ilvl w:val="1"/>
+          <w:numId w:val="2"/>
+        </w:numPr>
+        <w:spacing w:line="276" w:lineRule="auto"/>
+      </w:pPr>
+      <w:r>
+        <w:t>Press “Apply Data” in the “Output Echo” Block (right block)</w:t>
+      </w:r>
+    </w:p>
+    <w:p>
+      <w:pPr>
+        <w:pStyle w:val="ListParagraph"/>
+        <w:numPr>
+          <w:ilvl w:val="1"/>
+          <w:numId w:val="2"/>
+        </w:numPr>
+        <w:spacing w:line="276" w:lineRule="auto"/>
+      </w:pPr>
+      <w:r>
+        <w:t>Confirm the values are desired</w:t>
+      </w:r>
+    </w:p>
+    <w:p>
+      <w:pPr>
+        <w:pStyle w:val="ListParagraph"/>
+        <w:numPr>
+          <w:ilvl w:val="1"/>
+          <w:numId w:val="2"/>
+        </w:numPr>
+        <w:spacing w:line="276" w:lineRule="auto"/>
+      </w:pPr>
+      <w:r>
+        <w:t>Ensure the “Changes Applied?” indicator is bright green</w:t>
+      </w:r>
+    </w:p>
+    <w:p>
+      <w:pPr>
+        <w:pStyle w:val="ListParagraph"/>
+        <w:numPr>
+          <w:ilvl w:val="1"/>
+          <w:numId w:val="2"/>
+        </w:numPr>
+        <w:spacing w:line="276" w:lineRule="auto"/>
+      </w:pPr>
+      <w:r>
+        <w:t>Press the Exit button</w:t>
       </w:r>
     </w:p>
     <w:p>
@@ -2683,52 +2979,8 @@
         <w:spacing w:line="276" w:lineRule="auto"/>
       </w:pPr>
       <w:r>
-        <w:t xml:space="preserve">If </w:t>
-      </w:r>
-      <w:proofErr w:type="spellStart"/>
-      <w:r>
-        <w:t>latchup</w:t>
-      </w:r>
-      <w:proofErr w:type="spellEnd"/>
-      <w:r>
-        <w:t xml:space="preserve"> test, put the heat gun on the part and </w:t>
-      </w:r>
-    </w:p>
-    <w:p>
-      <w:pPr>
-        <w:pStyle w:val="ListParagraph"/>
-        <w:numPr>
-          <w:ilvl w:val="0"/>
-          <w:numId w:val="2"/>
-        </w:numPr>
-      </w:pPr>
-      <w:r>
-        <w:t>Open LabVIEW on NI Tester</w:t>
-      </w:r>
-    </w:p>
-    <w:p>
-      <w:pPr>
-        <w:pStyle w:val="ListParagraph"/>
-        <w:numPr>
-          <w:ilvl w:val="0"/>
-          <w:numId w:val="2"/>
-        </w:numPr>
-        <w:spacing w:line="276" w:lineRule="auto"/>
-      </w:pPr>
-      <w:r>
-        <w:t xml:space="preserve">Go to </w:t>
-      </w:r>
-      <w:r>
-        <w:t>C:\</w:t>
-      </w:r>
-      <w:r>
-        <w:t xml:space="preserve"> Git\Rad-Effects-Test-Software\</w:t>
-      </w:r>
-      <w:proofErr w:type="spellStart"/>
-      <w:r>
-        <w:t>SEE_PXI_TopBench.lvproj</w:t>
-      </w:r>
-      <w:proofErr w:type="spellEnd"/>
+        <w:t>Configure the “Power Block”</w:t>
+      </w:r>
     </w:p>
     <w:p>
       <w:pPr>
@@ -2739,56 +2991,15 @@
         </w:numPr>
         <w:spacing w:line="276" w:lineRule="auto"/>
       </w:pPr>
-      <w:r>
-        <w:t>If there is a</w:t>
-      </w:r>
-      <w:r>
-        <w:t xml:space="preserve"> pop up, just press “load with selected”</w:t>
-      </w:r>
-    </w:p>
-    <w:p>
-      <w:pPr>
-        <w:pStyle w:val="ListParagraph"/>
-        <w:numPr>
-          <w:ilvl w:val="0"/>
-          <w:numId w:val="2"/>
-        </w:numPr>
-        <w:spacing w:line="276" w:lineRule="auto"/>
-      </w:pPr>
-      <w:r>
-        <w:t>If not running, press white arrow</w:t>
-      </w:r>
-    </w:p>
-    <w:p>
-      <w:pPr>
-        <w:pStyle w:val="ListParagraph"/>
-        <w:numPr>
-          <w:ilvl w:val="0"/>
-          <w:numId w:val="2"/>
-        </w:numPr>
-        <w:spacing w:line="276" w:lineRule="auto"/>
-      </w:pPr>
-      <w:r>
-        <w:t>Configure the “Data Block”</w:t>
-      </w:r>
-    </w:p>
-    <w:p>
-      <w:pPr>
-        <w:pStyle w:val="ListParagraph"/>
-        <w:numPr>
-          <w:ilvl w:val="1"/>
-          <w:numId w:val="2"/>
-        </w:numPr>
-        <w:spacing w:line="276" w:lineRule="auto"/>
-      </w:pPr>
-      <w:r>
-        <w:t>Change values in the “Run Data Input</w:t>
+      <w:bookmarkStart w:id="0" w:name="OLE_LINK8"/>
+      <w:r>
+        <w:t>Select “</w:t>
+      </w:r>
+      <w:r>
+        <w:t>PXIe4163</w:t>
       </w:r>
       <w:r>
         <w:t>”</w:t>
-      </w:r>
-      <w:r>
-        <w:t xml:space="preserve"> (Green Block)</w:t>
       </w:r>
     </w:p>
     <w:p>
@@ -2800,8 +3011,16 @@
         </w:numPr>
         <w:spacing w:line="276" w:lineRule="auto"/>
       </w:pPr>
-      <w:r>
-        <w:t>RUN FOLDER</w:t>
+      <w:bookmarkStart w:id="1" w:name="OLE_LINK1"/>
+      <w:r>
+        <w:lastRenderedPageBreak/>
+        <w:t>Select Active Channel 0</w:t>
+      </w:r>
+      <w:r>
+        <w:t xml:space="preserve"> through Active Channel 3</w:t>
+      </w:r>
+      <w:r>
+        <w:t xml:space="preserve"> (bright green when selected)</w:t>
       </w:r>
     </w:p>
     <w:p>
@@ -2814,176 +3033,6 @@
         <w:spacing w:line="276" w:lineRule="auto"/>
       </w:pPr>
       <w:r>
-        <w:t xml:space="preserve">DUT </w:t>
-      </w:r>
-    </w:p>
-    <w:p>
-      <w:pPr>
-        <w:pStyle w:val="ListParagraph"/>
-        <w:numPr>
-          <w:ilvl w:val="2"/>
-          <w:numId w:val="2"/>
-        </w:numPr>
-        <w:spacing w:line="276" w:lineRule="auto"/>
-      </w:pPr>
-      <w:r>
-        <w:t xml:space="preserve">ION </w:t>
-      </w:r>
-    </w:p>
-    <w:p>
-      <w:pPr>
-        <w:pStyle w:val="ListParagraph"/>
-        <w:numPr>
-          <w:ilvl w:val="2"/>
-          <w:numId w:val="2"/>
-        </w:numPr>
-        <w:spacing w:line="276" w:lineRule="auto"/>
-      </w:pPr>
-      <w:r>
-        <w:t>BOARD NUMBER</w:t>
-      </w:r>
-    </w:p>
-    <w:p>
-      <w:pPr>
-        <w:pStyle w:val="ListParagraph"/>
-        <w:numPr>
-          <w:ilvl w:val="2"/>
-          <w:numId w:val="2"/>
-        </w:numPr>
-        <w:spacing w:line="276" w:lineRule="auto"/>
-      </w:pPr>
-      <w:r>
-        <w:t>EFFECTVE LET</w:t>
-      </w:r>
-    </w:p>
-    <w:p>
-      <w:pPr>
-        <w:pStyle w:val="ListParagraph"/>
-        <w:numPr>
-          <w:ilvl w:val="2"/>
-          <w:numId w:val="2"/>
-        </w:numPr>
-        <w:spacing w:line="276" w:lineRule="auto"/>
-      </w:pPr>
-      <w:r>
-        <w:t>TEST TYPE (NOTE ONLY DOING LATCHUP THIS CAMPAIGN)</w:t>
-      </w:r>
-    </w:p>
-    <w:p>
-      <w:pPr>
-        <w:pStyle w:val="ListParagraph"/>
-        <w:numPr>
-          <w:ilvl w:val="1"/>
-          <w:numId w:val="2"/>
-        </w:numPr>
-        <w:spacing w:line="276" w:lineRule="auto"/>
-      </w:pPr>
-      <w:r>
-        <w:t>Press “Apply Data” in the “Output Echo” Block (right block)</w:t>
-      </w:r>
-    </w:p>
-    <w:p>
-      <w:pPr>
-        <w:pStyle w:val="ListParagraph"/>
-        <w:numPr>
-          <w:ilvl w:val="1"/>
-          <w:numId w:val="2"/>
-        </w:numPr>
-        <w:spacing w:line="276" w:lineRule="auto"/>
-      </w:pPr>
-      <w:r>
-        <w:t>Confirm the values are desired</w:t>
-      </w:r>
-    </w:p>
-    <w:p>
-      <w:pPr>
-        <w:pStyle w:val="ListParagraph"/>
-        <w:numPr>
-          <w:ilvl w:val="1"/>
-          <w:numId w:val="2"/>
-        </w:numPr>
-        <w:spacing w:line="276" w:lineRule="auto"/>
-      </w:pPr>
-      <w:r>
-        <w:t>Ensure the “Changes Applied?” indicator is bright green</w:t>
-      </w:r>
-    </w:p>
-    <w:p>
-      <w:pPr>
-        <w:pStyle w:val="ListParagraph"/>
-        <w:numPr>
-          <w:ilvl w:val="1"/>
-          <w:numId w:val="2"/>
-        </w:numPr>
-        <w:spacing w:line="276" w:lineRule="auto"/>
-      </w:pPr>
-      <w:r>
-        <w:t>Press the Exit button</w:t>
-      </w:r>
-    </w:p>
-    <w:p>
-      <w:pPr>
-        <w:pStyle w:val="ListParagraph"/>
-        <w:numPr>
-          <w:ilvl w:val="0"/>
-          <w:numId w:val="2"/>
-        </w:numPr>
-        <w:spacing w:line="276" w:lineRule="auto"/>
-      </w:pPr>
-      <w:r>
-        <w:t>Configure the “Power Block”</w:t>
-      </w:r>
-    </w:p>
-    <w:p>
-      <w:pPr>
-        <w:pStyle w:val="ListParagraph"/>
-        <w:numPr>
-          <w:ilvl w:val="1"/>
-          <w:numId w:val="2"/>
-        </w:numPr>
-        <w:spacing w:line="276" w:lineRule="auto"/>
-      </w:pPr>
-      <w:bookmarkStart w:id="0" w:name="OLE_LINK8"/>
-      <w:r>
-        <w:t>Select “</w:t>
-      </w:r>
-      <w:r>
-        <w:t>PXIe4163</w:t>
-      </w:r>
-      <w:r>
-        <w:t>”</w:t>
-      </w:r>
-    </w:p>
-    <w:p>
-      <w:pPr>
-        <w:pStyle w:val="ListParagraph"/>
-        <w:numPr>
-          <w:ilvl w:val="2"/>
-          <w:numId w:val="2"/>
-        </w:numPr>
-        <w:spacing w:line="276" w:lineRule="auto"/>
-      </w:pPr>
-      <w:bookmarkStart w:id="1" w:name="OLE_LINK1"/>
-      <w:r>
-        <w:t>Select Active Channel 0</w:t>
-      </w:r>
-      <w:r>
-        <w:t xml:space="preserve"> through Active Channel 3</w:t>
-      </w:r>
-      <w:r>
-        <w:t xml:space="preserve"> (bright green when selected)</w:t>
-      </w:r>
-    </w:p>
-    <w:p>
-      <w:pPr>
-        <w:pStyle w:val="ListParagraph"/>
-        <w:numPr>
-          <w:ilvl w:val="2"/>
-          <w:numId w:val="2"/>
-        </w:numPr>
-        <w:spacing w:line="276" w:lineRule="auto"/>
-      </w:pPr>
-      <w:r>
         <w:t>Refer to Table</w:t>
       </w:r>
       <w:r>
@@ -3003,7 +3052,6 @@
         <w:spacing w:line="276" w:lineRule="auto"/>
       </w:pPr>
       <w:r>
-        <w:lastRenderedPageBreak/>
         <w:t>AVOID USING SPACES AND PERIODS IN NAMES</w:t>
       </w:r>
     </w:p>
@@ -3995,6 +4043,7 @@
         <w:spacing w:line="276" w:lineRule="auto"/>
       </w:pPr>
       <w:r>
+        <w:lastRenderedPageBreak/>
         <w:t>Set “power” to -</w:t>
       </w:r>
       <w:r>
@@ -4051,7 +4100,6 @@
         <w:spacing w:line="276" w:lineRule="auto"/>
       </w:pPr>
       <w:r>
-        <w:lastRenderedPageBreak/>
         <w:t>Configure the Oscilloscope Block</w:t>
       </w:r>
     </w:p>

</xml_diff>